<commit_message>
docs(v8): Modul 3 & 4 — langkah praktikum dapat diikuti manual di Windows (cmd + VS Code)
Modul 3 (20 langkah): Tahap 1 tanpa ADR (kelompok migrasi, platform vs tenant-owned, target
composite unique); make:migration -> ren -> isi berkas; 14 model + 8 factory + seeder;
EXPLAIN nyata lewat php artisan db; mariadb-dump; data dictionary.
Modul 4 (23 langkah): Tahap 1 tanpa ADR (tabel keputusan konteks, resolver, bypass);
TenantContext scoped, SetTenantContext, PortalRoutes/bootstrap, trait pada delapan model
sebagai satu pola, policy + scopeBindings, PublicCatalogQuery, TenantIsolationTest.

Deteksi PHP untuk blok tanpa label diperbaiki (teks blok modul lain identik; hanya warna).
Diverifikasi: worktree bersih dari pertemuan-02/03; hasil identik 46a16a6 / db0e0ab
(kecuali satu kalimat rujukan ADR di docs/architecture.md); 55 / 65 test passed.
DOC-03-005, DOC-04-005.

Co-Authored-By: Claude Opus 5.5 <noreply@anthropic.com>
</commit_message>
<xml_diff>
--- a/modul_praktikum/Pertemuan_01_Persiapan_Tool_Development_dan_Konfigurasi_Lingkungan.docx
+++ b/modul_praktikum/Pertemuan_01_Persiapan_Tool_Development_dan_Konfigurasi_Lingkungan.docx
@@ -7341,7 +7341,40 @@
           <w:color w:val="262626"/>
           <w:sz w:val="16"/>
         </w:rPr>
-        <w:t xml:space="preserve">        &lt;env name=</w:t>
+        <w:t xml:space="preserve">        </w:t>
+      </w:r>
+      <w:r>
+        <w:rPr>
+          <w:rFonts w:ascii="Consolas" w:hAnsi="Consolas"/>
+          <w:b/>
+          <w:color w:val="000080"/>
+          <w:sz w:val="16"/>
+        </w:rPr>
+        <w:t xml:space="preserve">&lt;env</w:t>
+      </w:r>
+      <w:r>
+        <w:rPr>
+          <w:rFonts w:ascii="Consolas" w:hAnsi="Consolas"/>
+          <w:color w:val="262626"/>
+          <w:sz w:val="16"/>
+        </w:rPr>
+        <w:t xml:space="preserve"> </w:t>
+      </w:r>
+      <w:r>
+        <w:rPr>
+          <w:rFonts w:ascii="Consolas" w:hAnsi="Consolas"/>
+          <w:color w:val="0073E6"/>
+          <w:sz w:val="16"/>
+        </w:rPr>
+        <w:t xml:space="preserve">name</w:t>
+      </w:r>
+      <w:r>
+        <w:rPr>
+          <w:rFonts w:ascii="Consolas" w:hAnsi="Consolas"/>
+          <w:color w:val="262626"/>
+          <w:sz w:val="16"/>
+        </w:rPr>
+        <w:t xml:space="preserve">=</w:t>
       </w:r>
       <w:r>
         <w:rPr>
@@ -7357,7 +7390,23 @@
           <w:color w:val="262626"/>
           <w:sz w:val="16"/>
         </w:rPr>
-        <w:t xml:space="preserve"> value=</w:t>
+        <w:t xml:space="preserve"> </w:t>
+      </w:r>
+      <w:r>
+        <w:rPr>
+          <w:rFonts w:ascii="Consolas" w:hAnsi="Consolas"/>
+          <w:color w:val="0073E6"/>
+          <w:sz w:val="16"/>
+        </w:rPr>
+        <w:t xml:space="preserve">value</w:t>
+      </w:r>
+      <w:r>
+        <w:rPr>
+          <w:rFonts w:ascii="Consolas" w:hAnsi="Consolas"/>
+          <w:color w:val="262626"/>
+          <w:sz w:val="16"/>
+        </w:rPr>
+        <w:t xml:space="preserve">=</w:t>
       </w:r>
       <w:r>
         <w:rPr>
@@ -7370,13 +7419,31 @@
       <w:r>
         <w:rPr>
           <w:rFonts w:ascii="Consolas" w:hAnsi="Consolas"/>
+          <w:b/>
+          <w:color w:val="000080"/>
+          <w:sz w:val="16"/>
+        </w:rPr>
+        <w:t xml:space="preserve">/&gt;</w:t>
+      </w:r>
+      <w:r>
+        <w:br/>
+      </w:r>
+      <w:r>
+        <w:rPr>
+          <w:rFonts w:ascii="Consolas" w:hAnsi="Consolas"/>
           <w:color w:val="262626"/>
           <w:sz w:val="16"/>
         </w:rPr>
-        <w:t xml:space="preserve">/&gt;</w:t>
-      </w:r>
-      <w:r>
-        <w:br/>
+        <w:t xml:space="preserve">        </w:t>
+      </w:r>
+      <w:r>
+        <w:rPr>
+          <w:rFonts w:ascii="Consolas" w:hAnsi="Consolas"/>
+          <w:b/>
+          <w:color w:val="000080"/>
+          <w:sz w:val="16"/>
+        </w:rPr>
+        <w:t xml:space="preserve">&lt;env</w:t>
       </w:r>
       <w:r>
         <w:rPr>
@@ -7384,7 +7451,23 @@
           <w:color w:val="262626"/>
           <w:sz w:val="16"/>
         </w:rPr>
-        <w:t xml:space="preserve">        &lt;env name=</w:t>
+        <w:t xml:space="preserve"> </w:t>
+      </w:r>
+      <w:r>
+        <w:rPr>
+          <w:rFonts w:ascii="Consolas" w:hAnsi="Consolas"/>
+          <w:color w:val="0073E6"/>
+          <w:sz w:val="16"/>
+        </w:rPr>
+        <w:t xml:space="preserve">name</w:t>
+      </w:r>
+      <w:r>
+        <w:rPr>
+          <w:rFonts w:ascii="Consolas" w:hAnsi="Consolas"/>
+          <w:color w:val="262626"/>
+          <w:sz w:val="16"/>
+        </w:rPr>
+        <w:t xml:space="preserve">=</w:t>
       </w:r>
       <w:r>
         <w:rPr>
@@ -7400,7 +7483,23 @@
           <w:color w:val="262626"/>
           <w:sz w:val="16"/>
         </w:rPr>
-        <w:t xml:space="preserve"> value=</w:t>
+        <w:t xml:space="preserve"> </w:t>
+      </w:r>
+      <w:r>
+        <w:rPr>
+          <w:rFonts w:ascii="Consolas" w:hAnsi="Consolas"/>
+          <w:color w:val="0073E6"/>
+          <w:sz w:val="16"/>
+        </w:rPr>
+        <w:t xml:space="preserve">value</w:t>
+      </w:r>
+      <w:r>
+        <w:rPr>
+          <w:rFonts w:ascii="Consolas" w:hAnsi="Consolas"/>
+          <w:color w:val="262626"/>
+          <w:sz w:val="16"/>
+        </w:rPr>
+        <w:t xml:space="preserve">=</w:t>
       </w:r>
       <w:r>
         <w:rPr>
@@ -7413,7 +7512,8 @@
       <w:r>
         <w:rPr>
           <w:rFonts w:ascii="Consolas" w:hAnsi="Consolas"/>
-          <w:color w:val="262626"/>
+          <w:b/>
+          <w:color w:val="000080"/>
           <w:sz w:val="16"/>
         </w:rPr>
         <w:t xml:space="preserve">/&gt;</w:t>
@@ -7446,7 +7546,40 @@
           <w:color w:val="262626"/>
           <w:sz w:val="16"/>
         </w:rPr>
-        <w:t xml:space="preserve">        &lt;env name=</w:t>
+        <w:t xml:space="preserve">        </w:t>
+      </w:r>
+      <w:r>
+        <w:rPr>
+          <w:rFonts w:ascii="Consolas" w:hAnsi="Consolas"/>
+          <w:b/>
+          <w:color w:val="000080"/>
+          <w:sz w:val="16"/>
+        </w:rPr>
+        <w:t xml:space="preserve">&lt;env</w:t>
+      </w:r>
+      <w:r>
+        <w:rPr>
+          <w:rFonts w:ascii="Consolas" w:hAnsi="Consolas"/>
+          <w:color w:val="262626"/>
+          <w:sz w:val="16"/>
+        </w:rPr>
+        <w:t xml:space="preserve"> </w:t>
+      </w:r>
+      <w:r>
+        <w:rPr>
+          <w:rFonts w:ascii="Consolas" w:hAnsi="Consolas"/>
+          <w:color w:val="0073E6"/>
+          <w:sz w:val="16"/>
+        </w:rPr>
+        <w:t xml:space="preserve">name</w:t>
+      </w:r>
+      <w:r>
+        <w:rPr>
+          <w:rFonts w:ascii="Consolas" w:hAnsi="Consolas"/>
+          <w:color w:val="262626"/>
+          <w:sz w:val="16"/>
+        </w:rPr>
+        <w:t xml:space="preserve">=</w:t>
       </w:r>
       <w:r>
         <w:rPr>
@@ -7462,7 +7595,23 @@
           <w:color w:val="262626"/>
           <w:sz w:val="16"/>
         </w:rPr>
-        <w:t xml:space="preserve"> value=</w:t>
+        <w:t xml:space="preserve"> </w:t>
+      </w:r>
+      <w:r>
+        <w:rPr>
+          <w:rFonts w:ascii="Consolas" w:hAnsi="Consolas"/>
+          <w:color w:val="0073E6"/>
+          <w:sz w:val="16"/>
+        </w:rPr>
+        <w:t xml:space="preserve">value</w:t>
+      </w:r>
+      <w:r>
+        <w:rPr>
+          <w:rFonts w:ascii="Consolas" w:hAnsi="Consolas"/>
+          <w:color w:val="262626"/>
+          <w:sz w:val="16"/>
+        </w:rPr>
+        <w:t xml:space="preserve">=</w:t>
       </w:r>
       <w:r>
         <w:rPr>
@@ -7475,9 +7624,103 @@
       <w:r>
         <w:rPr>
           <w:rFonts w:ascii="Consolas" w:hAnsi="Consolas"/>
+          <w:b/>
+          <w:color w:val="000080"/>
+          <w:sz w:val="16"/>
+        </w:rPr>
+        <w:t xml:space="preserve">/&gt;</w:t>
+      </w:r>
+      <w:r>
+        <w:br/>
+      </w:r>
+      <w:r>
+        <w:rPr>
+          <w:rFonts w:ascii="Consolas" w:hAnsi="Consolas"/>
           <w:color w:val="262626"/>
           <w:sz w:val="16"/>
         </w:rPr>
+        <w:t xml:space="preserve">        </w:t>
+      </w:r>
+      <w:r>
+        <w:rPr>
+          <w:rFonts w:ascii="Consolas" w:hAnsi="Consolas"/>
+          <w:b/>
+          <w:color w:val="000080"/>
+          <w:sz w:val="16"/>
+        </w:rPr>
+        <w:t xml:space="preserve">&lt;env</w:t>
+      </w:r>
+      <w:r>
+        <w:rPr>
+          <w:rFonts w:ascii="Consolas" w:hAnsi="Consolas"/>
+          <w:color w:val="262626"/>
+          <w:sz w:val="16"/>
+        </w:rPr>
+        <w:t xml:space="preserve"> </w:t>
+      </w:r>
+      <w:r>
+        <w:rPr>
+          <w:rFonts w:ascii="Consolas" w:hAnsi="Consolas"/>
+          <w:color w:val="0073E6"/>
+          <w:sz w:val="16"/>
+        </w:rPr>
+        <w:t xml:space="preserve">name</w:t>
+      </w:r>
+      <w:r>
+        <w:rPr>
+          <w:rFonts w:ascii="Consolas" w:hAnsi="Consolas"/>
+          <w:color w:val="262626"/>
+          <w:sz w:val="16"/>
+        </w:rPr>
+        <w:t xml:space="preserve">=</w:t>
+      </w:r>
+      <w:r>
+        <w:rPr>
+          <w:rFonts w:ascii="Consolas" w:hAnsi="Consolas"/>
+          <w:color w:val="00733B"/>
+          <w:sz w:val="16"/>
+        </w:rPr>
+        <w:t xml:space="preserve">"DB_DATABASE"</w:t>
+      </w:r>
+      <w:r>
+        <w:rPr>
+          <w:rFonts w:ascii="Consolas" w:hAnsi="Consolas"/>
+          <w:color w:val="262626"/>
+          <w:sz w:val="16"/>
+        </w:rPr>
+        <w:t xml:space="preserve"> </w:t>
+      </w:r>
+      <w:r>
+        <w:rPr>
+          <w:rFonts w:ascii="Consolas" w:hAnsi="Consolas"/>
+          <w:color w:val="0073E6"/>
+          <w:sz w:val="16"/>
+        </w:rPr>
+        <w:t xml:space="preserve">value</w:t>
+      </w:r>
+      <w:r>
+        <w:rPr>
+          <w:rFonts w:ascii="Consolas" w:hAnsi="Consolas"/>
+          <w:color w:val="262626"/>
+          <w:sz w:val="16"/>
+        </w:rPr>
+        <w:t xml:space="preserve">=</w:t>
+      </w:r>
+      <w:r>
+        <w:rPr>
+          <w:rFonts w:ascii="Consolas" w:hAnsi="Consolas"/>
+          <w:color w:val="00733B"/>
+          <w:sz w:val="16"/>
+        </w:rPr>
+        <w:t xml:space="preserve">"kantin_test"</w:t>
+      </w:r>
+      <w:r>
+        <w:rPr>
+          <w:rFonts w:ascii="Consolas" w:hAnsi="Consolas"/>
+          <w:b/>
+          <w:color w:val="000080"/>
+          <w:sz w:val="16"/>
+        </w:rPr>
         <w:t xml:space="preserve">/&gt;</w:t>
       </w:r>
       <w:r>
@@ -7489,7 +7732,40 @@
           <w:color w:val="262626"/>
           <w:sz w:val="16"/>
         </w:rPr>
-        <w:t xml:space="preserve">        &lt;env name=</w:t>
+        <w:t xml:space="preserve">        </w:t>
+      </w:r>
+      <w:r>
+        <w:rPr>
+          <w:rFonts w:ascii="Consolas" w:hAnsi="Consolas"/>
+          <w:b/>
+          <w:color w:val="000080"/>
+          <w:sz w:val="16"/>
+        </w:rPr>
+        <w:t xml:space="preserve">&lt;env</w:t>
+      </w:r>
+      <w:r>
+        <w:rPr>
+          <w:rFonts w:ascii="Consolas" w:hAnsi="Consolas"/>
+          <w:color w:val="262626"/>
+          <w:sz w:val="16"/>
+        </w:rPr>
+        <w:t xml:space="preserve"> </w:t>
+      </w:r>
+      <w:r>
+        <w:rPr>
+          <w:rFonts w:ascii="Consolas" w:hAnsi="Consolas"/>
+          <w:color w:val="0073E6"/>
+          <w:sz w:val="16"/>
+        </w:rPr>
+        <w:t xml:space="preserve">name</w:t>
+      </w:r>
+      <w:r>
+        <w:rPr>
+          <w:rFonts w:ascii="Consolas" w:hAnsi="Consolas"/>
+          <w:color w:val="262626"/>
+          <w:sz w:val="16"/>
+        </w:rPr>
+        <w:t xml:space="preserve">=</w:t>
       </w:r>
       <w:r>
         <w:rPr>
@@ -7497,7 +7773,7 @@
           <w:color w:val="00733B"/>
           <w:sz w:val="16"/>
         </w:rPr>
-        <w:t xml:space="preserve">"DB_DATABASE"</w:t>
+        <w:t xml:space="preserve">"DB_HOST"</w:t>
       </w:r>
       <w:r>
         <w:rPr>
@@ -7505,7 +7781,23 @@
           <w:color w:val="262626"/>
           <w:sz w:val="16"/>
         </w:rPr>
-        <w:t xml:space="preserve"> value=</w:t>
+        <w:t xml:space="preserve"> </w:t>
+      </w:r>
+      <w:r>
+        <w:rPr>
+          <w:rFonts w:ascii="Consolas" w:hAnsi="Consolas"/>
+          <w:color w:val="0073E6"/>
+          <w:sz w:val="16"/>
+        </w:rPr>
+        <w:t xml:space="preserve">value</w:t>
+      </w:r>
+      <w:r>
+        <w:rPr>
+          <w:rFonts w:ascii="Consolas" w:hAnsi="Consolas"/>
+          <w:color w:val="262626"/>
+          <w:sz w:val="16"/>
+        </w:rPr>
+        <w:t xml:space="preserve">=</w:t>
       </w:r>
       <w:r>
         <w:rPr>
@@ -7513,7 +7805,19 @@
           <w:color w:val="00733B"/>
           <w:sz w:val="16"/>
         </w:rPr>
-        <w:t xml:space="preserve">"kantin_test"</w:t>
+        <w:t xml:space="preserve">"127.0.0.1"</w:t>
+      </w:r>
+      <w:r>
+        <w:rPr>
+          <w:rFonts w:ascii="Consolas" w:hAnsi="Consolas"/>
+          <w:b/>
+          <w:color w:val="000080"/>
+          <w:sz w:val="16"/>
+        </w:rPr>
+        <w:t xml:space="preserve">/&gt;</w:t>
+      </w:r>
+      <w:r>
+        <w:br/>
       </w:r>
       <w:r>
         <w:rPr>
@@ -7521,10 +7825,16 @@
           <w:color w:val="262626"/>
           <w:sz w:val="16"/>
         </w:rPr>
-        <w:t xml:space="preserve">/&gt;</w:t>
-      </w:r>
-      <w:r>
-        <w:br/>
+        <w:t xml:space="preserve">        </w:t>
+      </w:r>
+      <w:r>
+        <w:rPr>
+          <w:rFonts w:ascii="Consolas" w:hAnsi="Consolas"/>
+          <w:b/>
+          <w:color w:val="000080"/>
+          <w:sz w:val="16"/>
+        </w:rPr>
+        <w:t xml:space="preserve">&lt;env</w:t>
       </w:r>
       <w:r>
         <w:rPr>
@@ -7532,7 +7842,23 @@
           <w:color w:val="262626"/>
           <w:sz w:val="16"/>
         </w:rPr>
-        <w:t xml:space="preserve">        &lt;env name=</w:t>
+        <w:t xml:space="preserve"> </w:t>
+      </w:r>
+      <w:r>
+        <w:rPr>
+          <w:rFonts w:ascii="Consolas" w:hAnsi="Consolas"/>
+          <w:color w:val="0073E6"/>
+          <w:sz w:val="16"/>
+        </w:rPr>
+        <w:t xml:space="preserve">name</w:t>
+      </w:r>
+      <w:r>
+        <w:rPr>
+          <w:rFonts w:ascii="Consolas" w:hAnsi="Consolas"/>
+          <w:color w:val="262626"/>
+          <w:sz w:val="16"/>
+        </w:rPr>
+        <w:t xml:space="preserve">=</w:t>
       </w:r>
       <w:r>
         <w:rPr>
@@ -7540,7 +7866,7 @@
           <w:color w:val="00733B"/>
           <w:sz w:val="16"/>
         </w:rPr>
-        <w:t xml:space="preserve">"DB_HOST"</w:t>
+        <w:t xml:space="preserve">"DB_PORT"</w:t>
       </w:r>
       <w:r>
         <w:rPr>
@@ -7548,7 +7874,23 @@
           <w:color w:val="262626"/>
           <w:sz w:val="16"/>
         </w:rPr>
-        <w:t xml:space="preserve"> value=</w:t>
+        <w:t xml:space="preserve"> </w:t>
+      </w:r>
+      <w:r>
+        <w:rPr>
+          <w:rFonts w:ascii="Consolas" w:hAnsi="Consolas"/>
+          <w:color w:val="0073E6"/>
+          <w:sz w:val="16"/>
+        </w:rPr>
+        <w:t xml:space="preserve">value</w:t>
+      </w:r>
+      <w:r>
+        <w:rPr>
+          <w:rFonts w:ascii="Consolas" w:hAnsi="Consolas"/>
+          <w:color w:val="262626"/>
+          <w:sz w:val="16"/>
+        </w:rPr>
+        <w:t xml:space="preserve">=</w:t>
       </w:r>
       <w:r>
         <w:rPr>
@@ -7556,55 +7898,13 @@
           <w:color w:val="00733B"/>
           <w:sz w:val="16"/>
         </w:rPr>
-        <w:t xml:space="preserve">"127.0.0.1"</w:t>
-      </w:r>
-      <w:r>
-        <w:rPr>
-          <w:rFonts w:ascii="Consolas" w:hAnsi="Consolas"/>
-          <w:color w:val="262626"/>
-          <w:sz w:val="16"/>
-        </w:rPr>
-        <w:t xml:space="preserve">/&gt;</w:t>
-      </w:r>
-      <w:r>
-        <w:br/>
-      </w:r>
-      <w:r>
-        <w:rPr>
-          <w:rFonts w:ascii="Consolas" w:hAnsi="Consolas"/>
-          <w:color w:val="262626"/>
-          <w:sz w:val="16"/>
-        </w:rPr>
-        <w:t xml:space="preserve">        &lt;env name=</w:t>
-      </w:r>
-      <w:r>
-        <w:rPr>
-          <w:rFonts w:ascii="Consolas" w:hAnsi="Consolas"/>
-          <w:color w:val="00733B"/>
-          <w:sz w:val="16"/>
-        </w:rPr>
-        <w:t xml:space="preserve">"DB_PORT"</w:t>
-      </w:r>
-      <w:r>
-        <w:rPr>
-          <w:rFonts w:ascii="Consolas" w:hAnsi="Consolas"/>
-          <w:color w:val="262626"/>
-          <w:sz w:val="16"/>
-        </w:rPr>
-        <w:t xml:space="preserve"> value=</w:t>
-      </w:r>
-      <w:r>
-        <w:rPr>
-          <w:rFonts w:ascii="Consolas" w:hAnsi="Consolas"/>
-          <w:color w:val="00733B"/>
-          <w:sz w:val="16"/>
-        </w:rPr>
         <w:t xml:space="preserve">"3306"</w:t>
       </w:r>
       <w:r>
         <w:rPr>
           <w:rFonts w:ascii="Consolas" w:hAnsi="Consolas"/>
-          <w:color w:val="262626"/>
+          <w:b/>
+          <w:color w:val="000080"/>
           <w:sz w:val="16"/>
         </w:rPr>
         <w:t xml:space="preserve">/&gt;</w:t>

</xml_diff>